<commit_message>
security: remediate remaining audit findings and validate locally
</commit_message>
<xml_diff>
--- a/security-audit/KreateKaro_PreRelease_Security_Audit_Report.docx
+++ b/security-audit/KreateKaro_PreRelease_Security_Audit_Report.docx
@@ -20,12 +20,7 @@
     </w:p>
     <w:p>
       <w:r>
-        <w:t>Platform  KreateKaro / 3DM</w:t>
-      </w:r>
-    </w:p>
-    <w:p>
-      <w:r>
-        <w:t>Focused Pre Release Application Security Review</w:t>
+        <w:t>Remediation and release decision</w:t>
       </w:r>
     </w:p>
     <w:p>
@@ -35,22 +30,20 @@
     </w:p>
     <w:p>
       <w:r>
-        <w:t>Prepared using</w:t>
-        <w:br/>
-        <w:t>Authorized AI assisted security assessment</w:t>
+        <w:t>Prepared for founders and product stakeholders</w:t>
       </w:r>
     </w:p>
     <w:p>
-      <w:pPr>
-        <w:spacing w:after="560"/>
-      </w:pPr>
+      <w:r>
+        <w:t>Authorized AI assisted application security assessment</w:t>
+      </w:r>
     </w:p>
     <w:p>
       <w:pPr>
         <w:pStyle w:val="Heading1"/>
       </w:pPr>
       <w:r>
-        <w:t>RED</w:t>
+        <w:t>AMBER</w:t>
       </w:r>
     </w:p>
     <w:p>
@@ -58,30 +51,22 @@
         <w:rPr>
           <w:b/>
         </w:rPr>
-        <w:t>DO NOT PUBLICLY RELEASE YET</w:t>
+        <w:t>Local checks passed   Public release remains conditional</w:t>
       </w:r>
     </w:p>
     <w:p>
       <w:r>
-        <w:t>The review found important account and browser-content weaknesses. Several fixes are ready locally, but password protection still needs improvement and the Google sign-in changes need confirmation in a controlled release environment.</w:t>
+        <w:t>The twelve original findings now have implementation fixes. Nine are verified within the local review scope; three need further release verification. No code finding remains without a fix, and the dependency scanner reports zero advisories.</w:t>
       </w:r>
     </w:p>
     <w:p>
       <w:r>
-        <w:rPr>
-          <w:b/>
-        </w:rPr>
-        <w:t>Ready for public release  NO</w:t>
+        <w:t>This assessment covers the security-audit branch. It does not certify the unchanged public deployment. The user selected local validation only; no production account, database or website was changed.</w:t>
       </w:r>
     </w:p>
     <w:p>
       <w:r>
-        <w:t>This report supports a release decision for founders, management and other stakeholders. The technical evidence and reproducible checks are in the accompanying Markdown report.</w:t>
-      </w:r>
-    </w:p>
-    <w:p>
-      <w:r>
-        <w:t>No changes were deployed to the public website.</w:t>
+        <w:t>Use this report to decide the next release steps. Reproducible technical evidence is in the accompanying Markdown report.</w:t>
       </w:r>
     </w:p>
     <w:p>
@@ -99,17 +84,12 @@
     </w:p>
     <w:p>
       <w:r>
-        <w:t>KreateKaro is still under development. This review was performed before general customer release to identify the most important security problems while they can still be corrected. It deliberately focused on three areas rather than attempting a complete security certification.</w:t>
+        <w:t>The original review found three serious weaknesses involving password protection, unsafe logos and Google account matching, alongside nine other findings. The branch now includes fixes for all twelve. Tests confirm important controls work locally, including project ownership, verification code limits and shared-browser cleanup.</w:t>
       </w:r>
     </w:p>
     <w:p>
       <w:r>
-        <w:t>The application checks project ownership on the server. Local tests did not let one customer read, change or delete another customer’s cloud project. However, the review found weak password protection, unsafe Google account matching and a way for a malicious logo to run code in the browser.</w:t>
-      </w:r>
-    </w:p>
-    <w:p>
-      <w:r>
-        <w:t>Five issues received local fixes. Three passed the relevant local verification; two Google sign-in fixes still need confirmation with the real service. Seven findings remain open. The public site has not received these changes.</w:t>
+        <w:t>Public launch remains conditional because the real Google and email services, production password migration and target hosting settings have not been verified. These are release gates, not failed local tests.</w:t>
       </w:r>
     </w:p>
     <w:p>
@@ -130,7 +110,7 @@
     </w:p>
     <w:p>
       <w:r>
-        <w:t>We checked whether an unauthorized person could sign into or take over an account, misuse a session, or access another customer’s projects. This included passwords, verification codes, Google sign-in and cloud-project ownership.</w:t>
+        <w:t>Passwords, account registration, verification codes, sessions, Google account matching and ownership of cloud projects.</w:t>
       </w:r>
     </w:p>
     <w:p>
@@ -138,12 +118,12 @@
         <w:pStyle w:val="Heading2"/>
       </w:pPr>
       <w:r>
-        <w:t>Audit 2 Application and data input security</w:t>
+        <w:t>Audit 2 Application and input security</w:t>
       </w:r>
     </w:p>
     <w:p>
       <w:r>
-        <w:t>We checked whether manipulated requests, malicious input, uploaded files or other unexpected data could compromise the application or another user. A harmless test demonstrated the unsafe logo preview.</w:t>
+        <w:t>Logo previews, project and model validation, limits on saved designs, private browser storage and sign-out behavior.</w:t>
       </w:r>
     </w:p>
     <w:p>
@@ -151,12 +131,12 @@
         <w:pStyle w:val="Heading2"/>
       </w:pPr>
       <w:r>
-        <w:t>Audit 3 Platform configuration and software supply chain</w:t>
+        <w:t>Audit 3 Configuration and dependencies</w:t>
       </w:r>
     </w:p>
     <w:p>
       <w:r>
-        <w:t>We checked for exposed credentials, vulnerable software packages and important production configuration weaknesses. Public checks were limited to the homepage and the signed-out account response.</w:t>
+        <w:t>Software package advisories, secure response headers, browser content policy, secret handling and reproducible package configuration.</w:t>
       </w:r>
     </w:p>
     <w:p>
@@ -169,12 +149,15 @@
     </w:p>
     <w:p>
       <w:r>
-        <w:t>RED — Ready for public release: NO. Password storage remains a serious issue. The local fixes also need a controlled deployment and real account testing. Passing the automated tests does not mean all security findings are closed.</w:t>
+        <w:t>AMBER. All three local audit gates pass. All 31 automated tests, the API code check, the production build and the local Workers/database integration checks pass. A separate isolated browser test confirms the built editor works under its content policy and clears private draft state across two tabs at sign-out.</w:t>
       </w:r>
     </w:p>
     <w:p>
       <w:r>
-        <w:t>Local validation completed: 20 automated checks passed, the production build passed and the backend code check passed. No real customer data was used.</w:t>
+        <w:rPr>
+          <w:b/>
+        </w:rPr>
+        <w:t>Ready for unrestricted public release   NOT YET</w:t>
       </w:r>
     </w:p>
     <w:p>
@@ -193,15 +176,13 @@
     <w:tbl>
       <w:tblPr>
         <w:tblW w:type="auto" w:w="0"/>
-        <w:jc w:val="center"/>
         <w:tblLayout w:type="fixed"/>
         <w:tblLook w:firstColumn="1" w:firstRow="1" w:lastColumn="0" w:lastRow="0" w:noHBand="0" w:noVBand="1" w:val="04A0"/>
       </w:tblPr>
       <w:tblGrid>
-        <w:gridCol w:w="1872"/>
-        <w:gridCol w:w="1800"/>
-        <w:gridCol w:w="1224"/>
-        <w:gridCol w:w="4421"/>
+        <w:gridCol w:w="2376"/>
+        <w:gridCol w:w="1512"/>
+        <w:gridCol w:w="5717"/>
       </w:tblGrid>
       <w:tr>
         <w:trPr>
@@ -210,31 +191,17 @@
         </w:trPr>
         <w:tc>
           <w:tcPr>
-            <w:tcW w:type="dxa" w:w="1872"/>
-            <w:vAlign w:val="center"/>
-            <w:shd w:fill="243746"/>
-            <w:tcBorders>
-              <w:top w:val="single" w:sz="4" w:color="D9D9D9"/>
-              <w:left w:val="single" w:sz="4" w:color="D9D9D9"/>
-              <w:bottom w:val="single" w:sz="4" w:color="D9D9D9"/>
-              <w:right w:val="single" w:sz="4" w:color="D9D9D9"/>
-            </w:tcBorders>
-            <w:tcMar>
-              <w:top w:w="100" w:type="dxa"/>
-              <w:left w:w="100" w:type="dxa"/>
-              <w:bottom w:w="100" w:type="dxa"/>
-              <w:right w:w="100" w:type="dxa"/>
-            </w:tcMar>
+            <w:tcW w:type="dxa" w:w="2376"/>
+            <w:shd w:fill="E8EDF0"/>
           </w:tcPr>
           <w:p>
             <w:pPr>
-              <w:spacing w:after="40" w:before="40"/>
+              <w:spacing w:after="100"/>
             </w:pPr>
             <w:r>
               <w:rPr>
                 <w:b/>
-                <w:color w:val="FFFFFF"/>
-                <w:sz w:val="18"/>
+                <w:sz w:val="20"/>
               </w:rPr>
               <w:t>Area</w:t>
             </w:r>
@@ -242,97 +209,37 @@
         </w:tc>
         <w:tc>
           <w:tcPr>
-            <w:tcW w:type="dxa" w:w="1800"/>
-            <w:vAlign w:val="center"/>
-            <w:shd w:fill="243746"/>
-            <w:tcBorders>
-              <w:top w:val="single" w:sz="4" w:color="D9D9D9"/>
-              <w:left w:val="single" w:sz="4" w:color="D9D9D9"/>
-              <w:bottom w:val="single" w:sz="4" w:color="D9D9D9"/>
-              <w:right w:val="single" w:sz="4" w:color="D9D9D9"/>
-            </w:tcBorders>
-            <w:tcMar>
-              <w:top w:w="100" w:type="dxa"/>
-              <w:left w:w="100" w:type="dxa"/>
-              <w:bottom w:w="100" w:type="dxa"/>
-              <w:right w:w="100" w:type="dxa"/>
-            </w:tcMar>
+            <w:tcW w:type="dxa" w:w="1512"/>
+            <w:shd w:fill="E8EDF0"/>
           </w:tcPr>
           <w:p>
             <w:pPr>
-              <w:spacing w:after="40" w:before="40"/>
+              <w:spacing w:after="100"/>
             </w:pPr>
             <w:r>
               <w:rPr>
                 <w:b/>
-                <w:color w:val="FFFFFF"/>
-                <w:sz w:val="18"/>
+                <w:sz w:val="20"/>
               </w:rPr>
-              <w:t>Status</w:t>
+              <w:t>Local result</w:t>
             </w:r>
           </w:p>
         </w:tc>
         <w:tc>
           <w:tcPr>
-            <w:tcW w:type="dxa" w:w="1224"/>
-            <w:vAlign w:val="center"/>
-            <w:shd w:fill="243746"/>
-            <w:tcBorders>
-              <w:top w:val="single" w:sz="4" w:color="D9D9D9"/>
-              <w:left w:val="single" w:sz="4" w:color="D9D9D9"/>
-              <w:bottom w:val="single" w:sz="4" w:color="D9D9D9"/>
-              <w:right w:val="single" w:sz="4" w:color="D9D9D9"/>
-            </w:tcBorders>
-            <w:tcMar>
-              <w:top w:w="100" w:type="dxa"/>
-              <w:left w:w="100" w:type="dxa"/>
-              <w:bottom w:w="100" w:type="dxa"/>
-              <w:right w:w="100" w:type="dxa"/>
-            </w:tcMar>
+            <w:tcW w:type="dxa" w:w="5717"/>
+            <w:shd w:fill="E8EDF0"/>
           </w:tcPr>
           <w:p>
             <w:pPr>
-              <w:spacing w:after="40" w:before="40"/>
+              <w:spacing w:after="100"/>
             </w:pPr>
             <w:r>
               <w:rPr>
                 <w:b/>
-                <w:color w:val="FFFFFF"/>
-                <w:sz w:val="18"/>
+                <w:sz w:val="20"/>
               </w:rPr>
-              <w:t>Risk</w:t>
-            </w:r>
-          </w:p>
-        </w:tc>
-        <w:tc>
-          <w:tcPr>
-            <w:tcW w:type="dxa" w:w="4421"/>
-            <w:vAlign w:val="center"/>
-            <w:shd w:fill="243746"/>
-            <w:tcBorders>
-              <w:top w:val="single" w:sz="4" w:color="D9D9D9"/>
-              <w:left w:val="single" w:sz="4" w:color="D9D9D9"/>
-              <w:bottom w:val="single" w:sz="4" w:color="D9D9D9"/>
-              <w:right w:val="single" w:sz="4" w:color="D9D9D9"/>
-            </w:tcBorders>
-            <w:tcMar>
-              <w:top w:w="100" w:type="dxa"/>
-              <w:left w:w="100" w:type="dxa"/>
-              <w:bottom w:w="100" w:type="dxa"/>
-              <w:right w:w="100" w:type="dxa"/>
-            </w:tcMar>
-          </w:tcPr>
-          <w:p>
-            <w:pPr>
-              <w:spacing w:after="40" w:before="40"/>
-            </w:pPr>
-            <w:r>
-              <w:rPr>
-                <w:b/>
-                <w:color w:val="FFFFFF"/>
-                <w:sz w:val="18"/>
-              </w:rPr>
-              <w:t>Plain English outcome</w:t>
+              <w:t>Remaining release assurance</w:t>
             </w:r>
           </w:p>
         </w:tc>
@@ -343,31 +250,17 @@
         </w:trPr>
         <w:tc>
           <w:tcPr>
-            <w:tcW w:type="dxa" w:w="1872"/>
-            <w:vAlign w:val="center"/>
+            <w:tcW w:type="dxa" w:w="2376"/>
             <w:shd w:fill="FFFFFF"/>
-            <w:tcBorders>
-              <w:top w:val="single" w:sz="4" w:color="D9D9D9"/>
-              <w:left w:val="single" w:sz="4" w:color="D9D9D9"/>
-              <w:bottom w:val="single" w:sz="4" w:color="D9D9D9"/>
-              <w:right w:val="single" w:sz="4" w:color="D9D9D9"/>
-            </w:tcBorders>
-            <w:tcMar>
-              <w:top w:w="100" w:type="dxa"/>
-              <w:left w:w="100" w:type="dxa"/>
-              <w:bottom w:w="100" w:type="dxa"/>
-              <w:right w:w="100" w:type="dxa"/>
-            </w:tcMar>
           </w:tcPr>
           <w:p>
             <w:pPr>
-              <w:spacing w:after="40" w:before="40"/>
+              <w:spacing w:after="100"/>
             </w:pPr>
             <w:r>
               <w:rPr>
                 <w:b w:val="0"/>
-                <w:color w:val="000000"/>
-                <w:sz w:val="18"/>
+                <w:sz w:val="20"/>
               </w:rPr>
               <w:t>Account and access</w:t>
             </w:r>
@@ -375,97 +268,37 @@
         </w:tc>
         <w:tc>
           <w:tcPr>
-            <w:tcW w:type="dxa" w:w="1800"/>
-            <w:vAlign w:val="center"/>
+            <w:tcW w:type="dxa" w:w="1512"/>
             <w:shd w:fill="FFFFFF"/>
-            <w:tcBorders>
-              <w:top w:val="single" w:sz="4" w:color="D9D9D9"/>
-              <w:left w:val="single" w:sz="4" w:color="D9D9D9"/>
-              <w:bottom w:val="single" w:sz="4" w:color="D9D9D9"/>
-              <w:right w:val="single" w:sz="4" w:color="D9D9D9"/>
-            </w:tcBorders>
-            <w:tcMar>
-              <w:top w:w="100" w:type="dxa"/>
-              <w:left w:w="100" w:type="dxa"/>
-              <w:bottom w:w="100" w:type="dxa"/>
-              <w:right w:w="100" w:type="dxa"/>
-            </w:tcMar>
           </w:tcPr>
           <w:p>
             <w:pPr>
-              <w:spacing w:after="40" w:before="40"/>
+              <w:spacing w:after="100"/>
             </w:pPr>
             <w:r>
               <w:rPr>
                 <w:b w:val="0"/>
-                <w:color w:val="000000"/>
-                <w:sz w:val="18"/>
+                <w:sz w:val="20"/>
               </w:rPr>
-              <w:t>ACTION REQUIRED</w:t>
+              <w:t>PASS</w:t>
             </w:r>
           </w:p>
         </w:tc>
         <w:tc>
           <w:tcPr>
-            <w:tcW w:type="dxa" w:w="1224"/>
-            <w:vAlign w:val="center"/>
+            <w:tcW w:type="dxa" w:w="5717"/>
             <w:shd w:fill="FFFFFF"/>
-            <w:tcBorders>
-              <w:top w:val="single" w:sz="4" w:color="D9D9D9"/>
-              <w:left w:val="single" w:sz="4" w:color="D9D9D9"/>
-              <w:bottom w:val="single" w:sz="4" w:color="D9D9D9"/>
-              <w:right w:val="single" w:sz="4" w:color="D9D9D9"/>
-            </w:tcBorders>
-            <w:tcMar>
-              <w:top w:w="100" w:type="dxa"/>
-              <w:left w:w="100" w:type="dxa"/>
-              <w:bottom w:w="100" w:type="dxa"/>
-              <w:right w:w="100" w:type="dxa"/>
-            </w:tcMar>
           </w:tcPr>
           <w:p>
             <w:pPr>
-              <w:spacing w:after="40" w:before="40"/>
+              <w:spacing w:after="100"/>
             </w:pPr>
             <w:r>
               <w:rPr>
                 <w:b w:val="0"/>
-                <w:color w:val="000000"/>
-                <w:sz w:val="18"/>
+                <w:sz w:val="20"/>
               </w:rPr>
-              <w:t>High</w:t>
-            </w:r>
-          </w:p>
-        </w:tc>
-        <w:tc>
-          <w:tcPr>
-            <w:tcW w:type="dxa" w:w="4421"/>
-            <w:vAlign w:val="center"/>
-            <w:shd w:fill="FFFFFF"/>
-            <w:tcBorders>
-              <w:top w:val="single" w:sz="4" w:color="D9D9D9"/>
-              <w:left w:val="single" w:sz="4" w:color="D9D9D9"/>
-              <w:bottom w:val="single" w:sz="4" w:color="D9D9D9"/>
-              <w:right w:val="single" w:sz="4" w:color="D9D9D9"/>
-            </w:tcBorders>
-            <w:tcMar>
-              <w:top w:w="100" w:type="dxa"/>
-              <w:left w:w="100" w:type="dxa"/>
-              <w:bottom w:w="100" w:type="dxa"/>
-              <w:right w:w="100" w:type="dxa"/>
-            </w:tcMar>
-          </w:tcPr>
-          <w:p>
-            <w:pPr>
-              <w:spacing w:after="40" w:before="40"/>
-            </w:pPr>
-            <w:r>
-              <w:rPr>
-                <w:b w:val="0"/>
-                <w:color w:val="000000"/>
-                <w:sz w:val="18"/>
-              </w:rPr>
-              <w:t>Ownership checks passed; password storage and release verification remain.</w:t>
+              <w:t>Real providers, password backfill, old linked accounts and hosting CPU allowance.</w:t>
             </w:r>
           </w:p>
         </w:tc>
@@ -476,31 +309,17 @@
         </w:trPr>
         <w:tc>
           <w:tcPr>
-            <w:tcW w:type="dxa" w:w="1872"/>
-            <w:vAlign w:val="center"/>
-            <w:shd w:fill="F2F5F7"/>
-            <w:tcBorders>
-              <w:top w:val="single" w:sz="4" w:color="D9D9D9"/>
-              <w:left w:val="single" w:sz="4" w:color="D9D9D9"/>
-              <w:bottom w:val="single" w:sz="4" w:color="D9D9D9"/>
-              <w:right w:val="single" w:sz="4" w:color="D9D9D9"/>
-            </w:tcBorders>
-            <w:tcMar>
-              <w:top w:w="100" w:type="dxa"/>
-              <w:left w:w="100" w:type="dxa"/>
-              <w:bottom w:w="100" w:type="dxa"/>
-              <w:right w:w="100" w:type="dxa"/>
-            </w:tcMar>
+            <w:tcW w:type="dxa" w:w="2376"/>
+            <w:shd w:fill="FFFFFF"/>
           </w:tcPr>
           <w:p>
             <w:pPr>
-              <w:spacing w:after="40" w:before="40"/>
+              <w:spacing w:after="100"/>
             </w:pPr>
             <w:r>
               <w:rPr>
                 <w:b w:val="0"/>
-                <w:color w:val="000000"/>
-                <w:sz w:val="18"/>
+                <w:sz w:val="20"/>
               </w:rPr>
               <w:t>Application and input</w:t>
             </w:r>
@@ -508,97 +327,37 @@
         </w:tc>
         <w:tc>
           <w:tcPr>
-            <w:tcW w:type="dxa" w:w="1800"/>
-            <w:vAlign w:val="center"/>
-            <w:shd w:fill="F2F5F7"/>
-            <w:tcBorders>
-              <w:top w:val="single" w:sz="4" w:color="D9D9D9"/>
-              <w:left w:val="single" w:sz="4" w:color="D9D9D9"/>
-              <w:bottom w:val="single" w:sz="4" w:color="D9D9D9"/>
-              <w:right w:val="single" w:sz="4" w:color="D9D9D9"/>
-            </w:tcBorders>
-            <w:tcMar>
-              <w:top w:w="100" w:type="dxa"/>
-              <w:left w:w="100" w:type="dxa"/>
-              <w:bottom w:w="100" w:type="dxa"/>
-              <w:right w:w="100" w:type="dxa"/>
-            </w:tcMar>
+            <w:tcW w:type="dxa" w:w="1512"/>
+            <w:shd w:fill="FFFFFF"/>
           </w:tcPr>
           <w:p>
             <w:pPr>
-              <w:spacing w:after="40" w:before="40"/>
+              <w:spacing w:after="100"/>
             </w:pPr>
             <w:r>
               <w:rPr>
                 <w:b w:val="0"/>
-                <w:color w:val="000000"/>
-                <w:sz w:val="18"/>
+                <w:sz w:val="20"/>
               </w:rPr>
-              <w:t>ACTION REQUIRED</w:t>
+              <w:t>PASS</w:t>
             </w:r>
           </w:p>
         </w:tc>
         <w:tc>
           <w:tcPr>
-            <w:tcW w:type="dxa" w:w="1224"/>
-            <w:vAlign w:val="center"/>
-            <w:shd w:fill="F2F5F7"/>
-            <w:tcBorders>
-              <w:top w:val="single" w:sz="4" w:color="D9D9D9"/>
-              <w:left w:val="single" w:sz="4" w:color="D9D9D9"/>
-              <w:bottom w:val="single" w:sz="4" w:color="D9D9D9"/>
-              <w:right w:val="single" w:sz="4" w:color="D9D9D9"/>
-            </w:tcBorders>
-            <w:tcMar>
-              <w:top w:w="100" w:type="dxa"/>
-              <w:left w:w="100" w:type="dxa"/>
-              <w:bottom w:w="100" w:type="dxa"/>
-              <w:right w:w="100" w:type="dxa"/>
-            </w:tcMar>
+            <w:tcW w:type="dxa" w:w="5717"/>
+            <w:shd w:fill="FFFFFF"/>
           </w:tcPr>
           <w:p>
             <w:pPr>
-              <w:spacing w:after="40" w:before="40"/>
+              <w:spacing w:after="100"/>
             </w:pPr>
             <w:r>
               <w:rPr>
                 <w:b w:val="0"/>
-                <w:color w:val="000000"/>
-                <w:sz w:val="18"/>
+                <w:sz w:val="20"/>
               </w:rPr>
-              <w:t>High originally</w:t>
-            </w:r>
-          </w:p>
-        </w:tc>
-        <w:tc>
-          <w:tcPr>
-            <w:tcW w:type="dxa" w:w="4421"/>
-            <w:vAlign w:val="center"/>
-            <w:shd w:fill="F2F5F7"/>
-            <w:tcBorders>
-              <w:top w:val="single" w:sz="4" w:color="D9D9D9"/>
-              <w:left w:val="single" w:sz="4" w:color="D9D9D9"/>
-              <w:bottom w:val="single" w:sz="4" w:color="D9D9D9"/>
-              <w:right w:val="single" w:sz="4" w:color="D9D9D9"/>
-            </w:tcBorders>
-            <w:tcMar>
-              <w:top w:w="100" w:type="dxa"/>
-              <w:left w:w="100" w:type="dxa"/>
-              <w:bottom w:w="100" w:type="dxa"/>
-              <w:right w:w="100" w:type="dxa"/>
-            </w:tcMar>
-          </w:tcPr>
-          <w:p>
-            <w:pPr>
-              <w:spacing w:after="40" w:before="40"/>
-            </w:pPr>
-            <w:r>
-              <w:rPr>
-                <w:b w:val="0"/>
-                <w:color w:val="000000"/>
-                <w:sz w:val="18"/>
-              </w:rPr>
-              <w:t>Logo preview fixed locally; input and asset limits remain.</w:t>
+              <w:t>Representative imports/exports and supported-browser release checks.</w:t>
             </w:r>
           </w:p>
         </w:tc>
@@ -609,95 +368,127 @@
         </w:trPr>
         <w:tc>
           <w:tcPr>
-            <w:tcW w:type="dxa" w:w="1872"/>
-            <w:vAlign w:val="center"/>
+            <w:tcW w:type="dxa" w:w="2376"/>
             <w:shd w:fill="FFFFFF"/>
-            <w:tcBorders>
-              <w:top w:val="single" w:sz="4" w:color="D9D9D9"/>
-              <w:left w:val="single" w:sz="4" w:color="D9D9D9"/>
-              <w:bottom w:val="single" w:sz="4" w:color="D9D9D9"/>
-              <w:right w:val="single" w:sz="4" w:color="D9D9D9"/>
-            </w:tcBorders>
-            <w:tcMar>
-              <w:top w:w="100" w:type="dxa"/>
-              <w:left w:w="100" w:type="dxa"/>
-              <w:bottom w:w="100" w:type="dxa"/>
-              <w:right w:w="100" w:type="dxa"/>
-            </w:tcMar>
           </w:tcPr>
           <w:p>
             <w:pPr>
-              <w:spacing w:after="40" w:before="40"/>
+              <w:spacing w:after="100"/>
             </w:pPr>
             <w:r>
               <w:rPr>
                 <w:b w:val="0"/>
-                <w:color w:val="000000"/>
-                <w:sz w:val="18"/>
+                <w:sz w:val="20"/>
               </w:rPr>
-              <w:t>Secrets and dependencies</w:t>
+              <w:t>Configuration and dependencies</w:t>
             </w:r>
           </w:p>
         </w:tc>
         <w:tc>
           <w:tcPr>
-            <w:tcW w:type="dxa" w:w="1800"/>
-            <w:vAlign w:val="center"/>
+            <w:tcW w:type="dxa" w:w="1512"/>
             <w:shd w:fill="FFFFFF"/>
-            <w:tcBorders>
-              <w:top w:val="single" w:sz="4" w:color="D9D9D9"/>
-              <w:left w:val="single" w:sz="4" w:color="D9D9D9"/>
-              <w:bottom w:val="single" w:sz="4" w:color="D9D9D9"/>
-              <w:right w:val="single" w:sz="4" w:color="D9D9D9"/>
-            </w:tcBorders>
-            <w:tcMar>
-              <w:top w:w="100" w:type="dxa"/>
-              <w:left w:w="100" w:type="dxa"/>
-              <w:bottom w:w="100" w:type="dxa"/>
-              <w:right w:w="100" w:type="dxa"/>
-            </w:tcMar>
           </w:tcPr>
           <w:p>
             <w:pPr>
-              <w:spacing w:after="40" w:before="40"/>
+              <w:spacing w:after="100"/>
             </w:pPr>
             <w:r>
               <w:rPr>
                 <w:b w:val="0"/>
-                <w:color w:val="000000"/>
-                <w:sz w:val="18"/>
+                <w:sz w:val="20"/>
               </w:rPr>
-              <w:t>ACTION REQUIRED</w:t>
+              <w:t>PASS</w:t>
             </w:r>
           </w:p>
         </w:tc>
         <w:tc>
           <w:tcPr>
-            <w:tcW w:type="dxa" w:w="1224"/>
-            <w:vAlign w:val="center"/>
+            <w:tcW w:type="dxa" w:w="5717"/>
             <w:shd w:fill="FFFFFF"/>
-            <w:tcBorders>
-              <w:top w:val="single" w:sz="4" w:color="D9D9D9"/>
-              <w:left w:val="single" w:sz="4" w:color="D9D9D9"/>
-              <w:bottom w:val="single" w:sz="4" w:color="D9D9D9"/>
-              <w:right w:val="single" w:sz="4" w:color="D9D9D9"/>
-            </w:tcBorders>
-            <w:tcMar>
-              <w:top w:w="100" w:type="dxa"/>
-              <w:left w:w="100" w:type="dxa"/>
-              <w:bottom w:w="100" w:type="dxa"/>
-              <w:right w:w="100" w:type="dxa"/>
-            </w:tcMar>
           </w:tcPr>
           <w:p>
             <w:pPr>
-              <w:spacing w:after="40" w:before="40"/>
+              <w:spacing w:after="100"/>
             </w:pPr>
             <w:r>
               <w:rPr>
                 <w:b w:val="0"/>
-                <w:color w:val="000000"/>
-                <w:sz w:val="18"/>
+                <w:sz w:val="20"/>
+              </w:rPr>
+              <w:t>Apply secrets/migration and verify actual deployment headers.</w:t>
+            </w:r>
+          </w:p>
+        </w:tc>
+      </w:tr>
+    </w:tbl>
+    <w:p/>
+    <w:tbl>
+      <w:tblPr>
+        <w:tblW w:type="auto" w:w="0"/>
+        <w:tblLayout w:type="fixed"/>
+        <w:tblLook w:firstColumn="1" w:firstRow="1" w:lastColumn="0" w:lastRow="0" w:noHBand="0" w:noVBand="1" w:val="04A0"/>
+      </w:tblPr>
+      <w:tblGrid>
+        <w:gridCol w:w="2376"/>
+        <w:gridCol w:w="2376"/>
+        <w:gridCol w:w="2376"/>
+        <w:gridCol w:w="2477"/>
+      </w:tblGrid>
+      <w:tr>
+        <w:trPr>
+          <w:cantSplit/>
+          <w:tblHeader/>
+        </w:trPr>
+        <w:tc>
+          <w:tcPr>
+            <w:tcW w:type="dxa" w:w="2376"/>
+            <w:shd w:fill="E8EDF0"/>
+          </w:tcPr>
+          <w:p>
+            <w:pPr>
+              <w:spacing w:after="100"/>
+            </w:pPr>
+            <w:r>
+              <w:rPr>
+                <w:b/>
+                <w:sz w:val="20"/>
+              </w:rPr>
+              <w:t>Critical</w:t>
+            </w:r>
+          </w:p>
+        </w:tc>
+        <w:tc>
+          <w:tcPr>
+            <w:tcW w:type="dxa" w:w="2376"/>
+            <w:shd w:fill="E8EDF0"/>
+          </w:tcPr>
+          <w:p>
+            <w:pPr>
+              <w:spacing w:after="100"/>
+            </w:pPr>
+            <w:r>
+              <w:rPr>
+                <w:b/>
+                <w:sz w:val="20"/>
+              </w:rPr>
+              <w:t>High</w:t>
+            </w:r>
+          </w:p>
+        </w:tc>
+        <w:tc>
+          <w:tcPr>
+            <w:tcW w:type="dxa" w:w="2376"/>
+            <w:shd w:fill="E8EDF0"/>
+          </w:tcPr>
+          <w:p>
+            <w:pPr>
+              <w:spacing w:after="100"/>
+            </w:pPr>
+            <w:r>
+              <w:rPr>
+                <w:b/>
+                <w:sz w:val="20"/>
               </w:rPr>
               <w:t>Medium</w:t>
             </w:r>
@@ -705,33 +496,19 @@
         </w:tc>
         <w:tc>
           <w:tcPr>
-            <w:tcW w:type="dxa" w:w="4421"/>
-            <w:vAlign w:val="center"/>
-            <w:shd w:fill="FFFFFF"/>
-            <w:tcBorders>
-              <w:top w:val="single" w:sz="4" w:color="D9D9D9"/>
-              <w:left w:val="single" w:sz="4" w:color="D9D9D9"/>
-              <w:bottom w:val="single" w:sz="4" w:color="D9D9D9"/>
-              <w:right w:val="single" w:sz="4" w:color="D9D9D9"/>
-            </w:tcBorders>
-            <w:tcMar>
-              <w:top w:w="100" w:type="dxa"/>
-              <w:left w:w="100" w:type="dxa"/>
-              <w:bottom w:w="100" w:type="dxa"/>
-              <w:right w:w="100" w:type="dxa"/>
-            </w:tcMar>
+            <w:tcW w:type="dxa" w:w="2477"/>
+            <w:shd w:fill="E8EDF0"/>
           </w:tcPr>
           <w:p>
             <w:pPr>
-              <w:spacing w:after="40" w:before="40"/>
+              <w:spacing w:after="100"/>
             </w:pPr>
             <w:r>
               <w:rPr>
-                <w:b w:val="0"/>
-                <w:color w:val="000000"/>
-                <w:sz w:val="18"/>
+                <w:b/>
+                <w:sz w:val="20"/>
               </w:rPr>
-              <w:t>No committed secret identified in the scoped scan; software updates required.</w:t>
+              <w:t>Low</w:t>
             </w:r>
           </w:p>
         </w:tc>
@@ -742,412 +519,17 @@
         </w:trPr>
         <w:tc>
           <w:tcPr>
-            <w:tcW w:type="dxa" w:w="1872"/>
-            <w:vAlign w:val="center"/>
-            <w:shd w:fill="F2F5F7"/>
-            <w:tcBorders>
-              <w:top w:val="single" w:sz="4" w:color="D9D9D9"/>
-              <w:left w:val="single" w:sz="4" w:color="D9D9D9"/>
-              <w:bottom w:val="single" w:sz="4" w:color="D9D9D9"/>
-              <w:right w:val="single" w:sz="4" w:color="D9D9D9"/>
-            </w:tcBorders>
-            <w:tcMar>
-              <w:top w:w="100" w:type="dxa"/>
-              <w:left w:w="100" w:type="dxa"/>
-              <w:bottom w:w="100" w:type="dxa"/>
-              <w:right w:w="100" w:type="dxa"/>
-            </w:tcMar>
+            <w:tcW w:type="dxa" w:w="2376"/>
+            <w:shd w:fill="FFFFFF"/>
           </w:tcPr>
           <w:p>
             <w:pPr>
-              <w:spacing w:after="40" w:before="40"/>
+              <w:spacing w:after="100"/>
             </w:pPr>
             <w:r>
               <w:rPr>
                 <w:b w:val="0"/>
-                <w:color w:val="000000"/>
-                <w:sz w:val="18"/>
-              </w:rPr>
-              <w:t>Production configuration</w:t>
-            </w:r>
-          </w:p>
-        </w:tc>
-        <w:tc>
-          <w:tcPr>
-            <w:tcW w:type="dxa" w:w="1800"/>
-            <w:vAlign w:val="center"/>
-            <w:shd w:fill="F2F5F7"/>
-            <w:tcBorders>
-              <w:top w:val="single" w:sz="4" w:color="D9D9D9"/>
-              <w:left w:val="single" w:sz="4" w:color="D9D9D9"/>
-              <w:bottom w:val="single" w:sz="4" w:color="D9D9D9"/>
-              <w:right w:val="single" w:sz="4" w:color="D9D9D9"/>
-            </w:tcBorders>
-            <w:tcMar>
-              <w:top w:w="100" w:type="dxa"/>
-              <w:left w:w="100" w:type="dxa"/>
-              <w:bottom w:w="100" w:type="dxa"/>
-              <w:right w:w="100" w:type="dxa"/>
-            </w:tcMar>
-          </w:tcPr>
-          <w:p>
-            <w:pPr>
-              <w:spacing w:after="40" w:before="40"/>
-            </w:pPr>
-            <w:r>
-              <w:rPr>
-                <w:b w:val="0"/>
-                <w:color w:val="000000"/>
-                <w:sz w:val="18"/>
-              </w:rPr>
-              <w:t>PASS WITH IMPROVEMENTS</w:t>
-            </w:r>
-          </w:p>
-        </w:tc>
-        <w:tc>
-          <w:tcPr>
-            <w:tcW w:type="dxa" w:w="1224"/>
-            <w:vAlign w:val="center"/>
-            <w:shd w:fill="F2F5F7"/>
-            <w:tcBorders>
-              <w:top w:val="single" w:sz="4" w:color="D9D9D9"/>
-              <w:left w:val="single" w:sz="4" w:color="D9D9D9"/>
-              <w:bottom w:val="single" w:sz="4" w:color="D9D9D9"/>
-              <w:right w:val="single" w:sz="4" w:color="D9D9D9"/>
-            </w:tcBorders>
-            <w:tcMar>
-              <w:top w:w="100" w:type="dxa"/>
-              <w:left w:w="100" w:type="dxa"/>
-              <w:bottom w:w="100" w:type="dxa"/>
-              <w:right w:w="100" w:type="dxa"/>
-            </w:tcMar>
-          </w:tcPr>
-          <w:p>
-            <w:pPr>
-              <w:spacing w:after="40" w:before="40"/>
-            </w:pPr>
-            <w:r>
-              <w:rPr>
-                <w:b w:val="0"/>
-                <w:color w:val="000000"/>
-                <w:sz w:val="18"/>
-              </w:rPr>
-              <w:t>Low</w:t>
-            </w:r>
-          </w:p>
-        </w:tc>
-        <w:tc>
-          <w:tcPr>
-            <w:tcW w:type="dxa" w:w="4421"/>
-            <w:vAlign w:val="center"/>
-            <w:shd w:fill="F2F5F7"/>
-            <w:tcBorders>
-              <w:top w:val="single" w:sz="4" w:color="D9D9D9"/>
-              <w:left w:val="single" w:sz="4" w:color="D9D9D9"/>
-              <w:bottom w:val="single" w:sz="4" w:color="D9D9D9"/>
-              <w:right w:val="single" w:sz="4" w:color="D9D9D9"/>
-            </w:tcBorders>
-            <w:tcMar>
-              <w:top w:w="100" w:type="dxa"/>
-              <w:left w:w="100" w:type="dxa"/>
-              <w:bottom w:w="100" w:type="dxa"/>
-              <w:right w:w="100" w:type="dxa"/>
-            </w:tcMar>
-          </w:tcPr>
-          <w:p>
-            <w:pPr>
-              <w:spacing w:after="40" w:before="40"/>
-            </w:pPr>
-            <w:r>
-              <w:rPr>
-                <w:b w:val="0"/>
-                <w:color w:val="000000"/>
-                <w:sz w:val="18"/>
-              </w:rPr>
-              <w:t>Some browser protections exist; headers and deployed fixes need review.</w:t>
-            </w:r>
-          </w:p>
-        </w:tc>
-      </w:tr>
-    </w:tbl>
-    <w:p/>
-    <w:tbl>
-      <w:tblPr>
-        <w:tblW w:type="auto" w:w="0"/>
-        <w:jc w:val="center"/>
-        <w:tblLayout w:type="fixed"/>
-        <w:tblLook w:firstColumn="1" w:firstRow="1" w:lastColumn="0" w:lastRow="0" w:noHBand="0" w:noVBand="1" w:val="04A0"/>
-      </w:tblPr>
-      <w:tblGrid>
-        <w:gridCol w:w="1008"/>
-        <w:gridCol w:w="792"/>
-        <w:gridCol w:w="1008"/>
-        <w:gridCol w:w="720"/>
-        <w:gridCol w:w="1800"/>
-        <w:gridCol w:w="1800"/>
-        <w:gridCol w:w="2189"/>
-      </w:tblGrid>
-      <w:tr>
-        <w:trPr>
-          <w:cantSplit/>
-          <w:tblHeader/>
-        </w:trPr>
-        <w:tc>
-          <w:tcPr>
-            <w:tcW w:type="dxa" w:w="1008"/>
-            <w:vAlign w:val="center"/>
-            <w:shd w:fill="243746"/>
-            <w:tcBorders>
-              <w:top w:val="single" w:sz="4" w:color="D9D9D9"/>
-              <w:left w:val="single" w:sz="4" w:color="D9D9D9"/>
-              <w:bottom w:val="single" w:sz="4" w:color="D9D9D9"/>
-              <w:right w:val="single" w:sz="4" w:color="D9D9D9"/>
-            </w:tcBorders>
-            <w:tcMar>
-              <w:top w:w="100" w:type="dxa"/>
-              <w:left w:w="100" w:type="dxa"/>
-              <w:bottom w:w="100" w:type="dxa"/>
-              <w:right w:w="100" w:type="dxa"/>
-            </w:tcMar>
-          </w:tcPr>
-          <w:p>
-            <w:pPr>
-              <w:spacing w:after="40" w:before="40"/>
-            </w:pPr>
-            <w:r>
-              <w:rPr>
-                <w:b/>
-                <w:color w:val="FFFFFF"/>
-                <w:sz w:val="18"/>
-              </w:rPr>
-              <w:t>Critical</w:t>
-            </w:r>
-          </w:p>
-        </w:tc>
-        <w:tc>
-          <w:tcPr>
-            <w:tcW w:type="dxa" w:w="792"/>
-            <w:vAlign w:val="center"/>
-            <w:shd w:fill="243746"/>
-            <w:tcBorders>
-              <w:top w:val="single" w:sz="4" w:color="D9D9D9"/>
-              <w:left w:val="single" w:sz="4" w:color="D9D9D9"/>
-              <w:bottom w:val="single" w:sz="4" w:color="D9D9D9"/>
-              <w:right w:val="single" w:sz="4" w:color="D9D9D9"/>
-            </w:tcBorders>
-            <w:tcMar>
-              <w:top w:w="100" w:type="dxa"/>
-              <w:left w:w="100" w:type="dxa"/>
-              <w:bottom w:w="100" w:type="dxa"/>
-              <w:right w:w="100" w:type="dxa"/>
-            </w:tcMar>
-          </w:tcPr>
-          <w:p>
-            <w:pPr>
-              <w:spacing w:after="40" w:before="40"/>
-            </w:pPr>
-            <w:r>
-              <w:rPr>
-                <w:b/>
-                <w:color w:val="FFFFFF"/>
-                <w:sz w:val="18"/>
-              </w:rPr>
-              <w:t>High</w:t>
-            </w:r>
-          </w:p>
-        </w:tc>
-        <w:tc>
-          <w:tcPr>
-            <w:tcW w:type="dxa" w:w="1008"/>
-            <w:vAlign w:val="center"/>
-            <w:shd w:fill="243746"/>
-            <w:tcBorders>
-              <w:top w:val="single" w:sz="4" w:color="D9D9D9"/>
-              <w:left w:val="single" w:sz="4" w:color="D9D9D9"/>
-              <w:bottom w:val="single" w:sz="4" w:color="D9D9D9"/>
-              <w:right w:val="single" w:sz="4" w:color="D9D9D9"/>
-            </w:tcBorders>
-            <w:tcMar>
-              <w:top w:w="100" w:type="dxa"/>
-              <w:left w:w="100" w:type="dxa"/>
-              <w:bottom w:w="100" w:type="dxa"/>
-              <w:right w:w="100" w:type="dxa"/>
-            </w:tcMar>
-          </w:tcPr>
-          <w:p>
-            <w:pPr>
-              <w:spacing w:after="40" w:before="40"/>
-            </w:pPr>
-            <w:r>
-              <w:rPr>
-                <w:b/>
-                <w:color w:val="FFFFFF"/>
-                <w:sz w:val="18"/>
-              </w:rPr>
-              <w:t>Medium</w:t>
-            </w:r>
-          </w:p>
-        </w:tc>
-        <w:tc>
-          <w:tcPr>
-            <w:tcW w:type="dxa" w:w="720"/>
-            <w:vAlign w:val="center"/>
-            <w:shd w:fill="243746"/>
-            <w:tcBorders>
-              <w:top w:val="single" w:sz="4" w:color="D9D9D9"/>
-              <w:left w:val="single" w:sz="4" w:color="D9D9D9"/>
-              <w:bottom w:val="single" w:sz="4" w:color="D9D9D9"/>
-              <w:right w:val="single" w:sz="4" w:color="D9D9D9"/>
-            </w:tcBorders>
-            <w:tcMar>
-              <w:top w:w="100" w:type="dxa"/>
-              <w:left w:w="100" w:type="dxa"/>
-              <w:bottom w:w="100" w:type="dxa"/>
-              <w:right w:w="100" w:type="dxa"/>
-            </w:tcMar>
-          </w:tcPr>
-          <w:p>
-            <w:pPr>
-              <w:spacing w:after="40" w:before="40"/>
-            </w:pPr>
-            <w:r>
-              <w:rPr>
-                <w:b/>
-                <w:color w:val="FFFFFF"/>
-                <w:sz w:val="18"/>
-              </w:rPr>
-              <w:t>Low</w:t>
-            </w:r>
-          </w:p>
-        </w:tc>
-        <w:tc>
-          <w:tcPr>
-            <w:tcW w:type="dxa" w:w="1800"/>
-            <w:vAlign w:val="center"/>
-            <w:shd w:fill="243746"/>
-            <w:tcBorders>
-              <w:top w:val="single" w:sz="4" w:color="D9D9D9"/>
-              <w:left w:val="single" w:sz="4" w:color="D9D9D9"/>
-              <w:bottom w:val="single" w:sz="4" w:color="D9D9D9"/>
-              <w:right w:val="single" w:sz="4" w:color="D9D9D9"/>
-            </w:tcBorders>
-            <w:tcMar>
-              <w:top w:w="100" w:type="dxa"/>
-              <w:left w:w="100" w:type="dxa"/>
-              <w:bottom w:w="100" w:type="dxa"/>
-              <w:right w:w="100" w:type="dxa"/>
-            </w:tcMar>
-          </w:tcPr>
-          <w:p>
-            <w:pPr>
-              <w:spacing w:after="40" w:before="40"/>
-            </w:pPr>
-            <w:r>
-              <w:rPr>
-                <w:b/>
-                <w:color w:val="FFFFFF"/>
-                <w:sz w:val="18"/>
-              </w:rPr>
-              <w:t>Locally verified</w:t>
-            </w:r>
-          </w:p>
-        </w:tc>
-        <w:tc>
-          <w:tcPr>
-            <w:tcW w:type="dxa" w:w="1800"/>
-            <w:vAlign w:val="center"/>
-            <w:shd w:fill="243746"/>
-            <w:tcBorders>
-              <w:top w:val="single" w:sz="4" w:color="D9D9D9"/>
-              <w:left w:val="single" w:sz="4" w:color="D9D9D9"/>
-              <w:bottom w:val="single" w:sz="4" w:color="D9D9D9"/>
-              <w:right w:val="single" w:sz="4" w:color="D9D9D9"/>
-            </w:tcBorders>
-            <w:tcMar>
-              <w:top w:w="100" w:type="dxa"/>
-              <w:left w:w="100" w:type="dxa"/>
-              <w:bottom w:w="100" w:type="dxa"/>
-              <w:right w:w="100" w:type="dxa"/>
-            </w:tcMar>
-          </w:tcPr>
-          <w:p>
-            <w:pPr>
-              <w:spacing w:after="40" w:before="40"/>
-            </w:pPr>
-            <w:r>
-              <w:rPr>
-                <w:b/>
-                <w:color w:val="FFFFFF"/>
-                <w:sz w:val="18"/>
-              </w:rPr>
-              <w:t>Pending check</w:t>
-            </w:r>
-          </w:p>
-        </w:tc>
-        <w:tc>
-          <w:tcPr>
-            <w:tcW w:type="dxa" w:w="2189"/>
-            <w:vAlign w:val="center"/>
-            <w:shd w:fill="243746"/>
-            <w:tcBorders>
-              <w:top w:val="single" w:sz="4" w:color="D9D9D9"/>
-              <w:left w:val="single" w:sz="4" w:color="D9D9D9"/>
-              <w:bottom w:val="single" w:sz="4" w:color="D9D9D9"/>
-              <w:right w:val="single" w:sz="4" w:color="D9D9D9"/>
-            </w:tcBorders>
-            <w:tcMar>
-              <w:top w:w="100" w:type="dxa"/>
-              <w:left w:w="100" w:type="dxa"/>
-              <w:bottom w:w="100" w:type="dxa"/>
-              <w:right w:w="100" w:type="dxa"/>
-            </w:tcMar>
-          </w:tcPr>
-          <w:p>
-            <w:pPr>
-              <w:spacing w:after="40" w:before="40"/>
-            </w:pPr>
-            <w:r>
-              <w:rPr>
-                <w:b/>
-                <w:color w:val="FFFFFF"/>
-                <w:sz w:val="18"/>
-              </w:rPr>
-              <w:t>Open</w:t>
-            </w:r>
-          </w:p>
-        </w:tc>
-      </w:tr>
-      <w:tr>
-        <w:trPr>
-          <w:cantSplit/>
-        </w:trPr>
-        <w:tc>
-          <w:tcPr>
-            <w:tcW w:type="dxa" w:w="1008"/>
-            <w:vAlign w:val="center"/>
-            <w:shd w:fill="FFFFFF"/>
-            <w:tcBorders>
-              <w:top w:val="single" w:sz="4" w:color="D9D9D9"/>
-              <w:left w:val="single" w:sz="4" w:color="D9D9D9"/>
-              <w:bottom w:val="single" w:sz="4" w:color="D9D9D9"/>
-              <w:right w:val="single" w:sz="4" w:color="D9D9D9"/>
-            </w:tcBorders>
-            <w:tcMar>
-              <w:top w:w="100" w:type="dxa"/>
-              <w:left w:w="100" w:type="dxa"/>
-              <w:bottom w:w="100" w:type="dxa"/>
-              <w:right w:w="100" w:type="dxa"/>
-            </w:tcMar>
-          </w:tcPr>
-          <w:p>
-            <w:pPr>
-              <w:spacing w:after="40" w:before="40"/>
-            </w:pPr>
-            <w:r>
-              <w:rPr>
-                <w:b w:val="0"/>
-                <w:color w:val="000000"/>
-                <w:sz w:val="18"/>
+                <w:sz w:val="20"/>
               </w:rPr>
               <w:t>0</w:t>
             </w:r>
@@ -1155,31 +537,17 @@
         </w:tc>
         <w:tc>
           <w:tcPr>
-            <w:tcW w:type="dxa" w:w="792"/>
-            <w:vAlign w:val="center"/>
+            <w:tcW w:type="dxa" w:w="2376"/>
             <w:shd w:fill="FFFFFF"/>
-            <w:tcBorders>
-              <w:top w:val="single" w:sz="4" w:color="D9D9D9"/>
-              <w:left w:val="single" w:sz="4" w:color="D9D9D9"/>
-              <w:bottom w:val="single" w:sz="4" w:color="D9D9D9"/>
-              <w:right w:val="single" w:sz="4" w:color="D9D9D9"/>
-            </w:tcBorders>
-            <w:tcMar>
-              <w:top w:w="100" w:type="dxa"/>
-              <w:left w:w="100" w:type="dxa"/>
-              <w:bottom w:w="100" w:type="dxa"/>
-              <w:right w:w="100" w:type="dxa"/>
-            </w:tcMar>
           </w:tcPr>
           <w:p>
             <w:pPr>
-              <w:spacing w:after="40" w:before="40"/>
+              <w:spacing w:after="100"/>
             </w:pPr>
             <w:r>
               <w:rPr>
                 <w:b w:val="0"/>
-                <w:color w:val="000000"/>
-                <w:sz w:val="18"/>
+                <w:sz w:val="20"/>
               </w:rPr>
               <w:t>3</w:t>
             </w:r>
@@ -1187,31 +555,17 @@
         </w:tc>
         <w:tc>
           <w:tcPr>
-            <w:tcW w:type="dxa" w:w="1008"/>
-            <w:vAlign w:val="center"/>
+            <w:tcW w:type="dxa" w:w="2376"/>
             <w:shd w:fill="FFFFFF"/>
-            <w:tcBorders>
-              <w:top w:val="single" w:sz="4" w:color="D9D9D9"/>
-              <w:left w:val="single" w:sz="4" w:color="D9D9D9"/>
-              <w:bottom w:val="single" w:sz="4" w:color="D9D9D9"/>
-              <w:right w:val="single" w:sz="4" w:color="D9D9D9"/>
-            </w:tcBorders>
-            <w:tcMar>
-              <w:top w:w="100" w:type="dxa"/>
-              <w:left w:w="100" w:type="dxa"/>
-              <w:bottom w:w="100" w:type="dxa"/>
-              <w:right w:w="100" w:type="dxa"/>
-            </w:tcMar>
           </w:tcPr>
           <w:p>
             <w:pPr>
-              <w:spacing w:after="40" w:before="40"/>
+              <w:spacing w:after="100"/>
             </w:pPr>
             <w:r>
               <w:rPr>
                 <w:b w:val="0"/>
-                <w:color w:val="000000"/>
-                <w:sz w:val="18"/>
+                <w:sz w:val="20"/>
               </w:rPr>
               <w:t>6</w:t>
             </w:r>
@@ -1219,129 +573,19 @@
         </w:tc>
         <w:tc>
           <w:tcPr>
-            <w:tcW w:type="dxa" w:w="720"/>
-            <w:vAlign w:val="center"/>
+            <w:tcW w:type="dxa" w:w="2477"/>
             <w:shd w:fill="FFFFFF"/>
-            <w:tcBorders>
-              <w:top w:val="single" w:sz="4" w:color="D9D9D9"/>
-              <w:left w:val="single" w:sz="4" w:color="D9D9D9"/>
-              <w:bottom w:val="single" w:sz="4" w:color="D9D9D9"/>
-              <w:right w:val="single" w:sz="4" w:color="D9D9D9"/>
-            </w:tcBorders>
-            <w:tcMar>
-              <w:top w:w="100" w:type="dxa"/>
-              <w:left w:w="100" w:type="dxa"/>
-              <w:bottom w:w="100" w:type="dxa"/>
-              <w:right w:w="100" w:type="dxa"/>
-            </w:tcMar>
           </w:tcPr>
           <w:p>
             <w:pPr>
-              <w:spacing w:after="40" w:before="40"/>
+              <w:spacing w:after="100"/>
             </w:pPr>
             <w:r>
               <w:rPr>
                 <w:b w:val="0"/>
-                <w:color w:val="000000"/>
-                <w:sz w:val="18"/>
+                <w:sz w:val="20"/>
               </w:rPr>
               <w:t>3</w:t>
-            </w:r>
-          </w:p>
-        </w:tc>
-        <w:tc>
-          <w:tcPr>
-            <w:tcW w:type="dxa" w:w="1800"/>
-            <w:vAlign w:val="center"/>
-            <w:shd w:fill="FFFFFF"/>
-            <w:tcBorders>
-              <w:top w:val="single" w:sz="4" w:color="D9D9D9"/>
-              <w:left w:val="single" w:sz="4" w:color="D9D9D9"/>
-              <w:bottom w:val="single" w:sz="4" w:color="D9D9D9"/>
-              <w:right w:val="single" w:sz="4" w:color="D9D9D9"/>
-            </w:tcBorders>
-            <w:tcMar>
-              <w:top w:w="100" w:type="dxa"/>
-              <w:left w:w="100" w:type="dxa"/>
-              <w:bottom w:w="100" w:type="dxa"/>
-              <w:right w:w="100" w:type="dxa"/>
-            </w:tcMar>
-          </w:tcPr>
-          <w:p>
-            <w:pPr>
-              <w:spacing w:after="40" w:before="40"/>
-            </w:pPr>
-            <w:r>
-              <w:rPr>
-                <w:b w:val="0"/>
-                <w:color w:val="000000"/>
-                <w:sz w:val="18"/>
-              </w:rPr>
-              <w:t>3</w:t>
-            </w:r>
-          </w:p>
-        </w:tc>
-        <w:tc>
-          <w:tcPr>
-            <w:tcW w:type="dxa" w:w="1800"/>
-            <w:vAlign w:val="center"/>
-            <w:shd w:fill="FFFFFF"/>
-            <w:tcBorders>
-              <w:top w:val="single" w:sz="4" w:color="D9D9D9"/>
-              <w:left w:val="single" w:sz="4" w:color="D9D9D9"/>
-              <w:bottom w:val="single" w:sz="4" w:color="D9D9D9"/>
-              <w:right w:val="single" w:sz="4" w:color="D9D9D9"/>
-            </w:tcBorders>
-            <w:tcMar>
-              <w:top w:w="100" w:type="dxa"/>
-              <w:left w:w="100" w:type="dxa"/>
-              <w:bottom w:w="100" w:type="dxa"/>
-              <w:right w:w="100" w:type="dxa"/>
-            </w:tcMar>
-          </w:tcPr>
-          <w:p>
-            <w:pPr>
-              <w:spacing w:after="40" w:before="40"/>
-            </w:pPr>
-            <w:r>
-              <w:rPr>
-                <w:b w:val="0"/>
-                <w:color w:val="000000"/>
-                <w:sz w:val="18"/>
-              </w:rPr>
-              <w:t>2</w:t>
-            </w:r>
-          </w:p>
-        </w:tc>
-        <w:tc>
-          <w:tcPr>
-            <w:tcW w:type="dxa" w:w="2189"/>
-            <w:vAlign w:val="center"/>
-            <w:shd w:fill="FFFFFF"/>
-            <w:tcBorders>
-              <w:top w:val="single" w:sz="4" w:color="D9D9D9"/>
-              <w:left w:val="single" w:sz="4" w:color="D9D9D9"/>
-              <w:bottom w:val="single" w:sz="4" w:color="D9D9D9"/>
-              <w:right w:val="single" w:sz="4" w:color="D9D9D9"/>
-            </w:tcBorders>
-            <w:tcMar>
-              <w:top w:w="100" w:type="dxa"/>
-              <w:left w:w="100" w:type="dxa"/>
-              <w:bottom w:w="100" w:type="dxa"/>
-              <w:right w:w="100" w:type="dxa"/>
-            </w:tcMar>
-          </w:tcPr>
-          <w:p>
-            <w:pPr>
-              <w:spacing w:after="40" w:before="40"/>
-            </w:pPr>
-            <w:r>
-              <w:rPr>
-                <w:b w:val="0"/>
-                <w:color w:val="000000"/>
-                <w:sz w:val="18"/>
-              </w:rPr>
-              <w:t>7</w:t>
             </w:r>
           </w:p>
         </w:tc>
@@ -1350,7 +594,7 @@
     <w:p/>
     <w:p>
       <w:r>
-        <w:t>Severity counts describe the original findings. “Open” excludes the two fixes waiting for manual checks; nine findings are not fully closed. Software-scanner alerts are not added to these application counts.</w:t>
+        <w:t>Counts retain the original finding severities. Nine findings are fixed and verified locally, three are fixed but waiting for manual confirmation, and zero remain without an implementation fix. The three pending findings are still unclosed for release. The separate dependency scan has zero advisories.</w:t>
       </w:r>
     </w:p>
     <w:p>
@@ -1374,12 +618,12 @@
         <w:rPr>
           <w:b/>
         </w:rPr>
-        <w:t>HIGH | OPEN</w:t>
+        <w:t>HIGH | WAITING FOR CONFIRMATION</w:t>
       </w:r>
     </w:p>
     <w:p>
       <w:r>
-        <w:t>If a database copy is stolen, the stored passwords would be too easy to guess. Replace the storage method and safely migrate existing accounts before release. This change needs testing on the hosting platform.</w:t>
+        <w:t>Passwords now use salted, deliberately expensive hashing. Local runtime and migration tests pass. Confirm the hosting CPU allowance and strengthen all old database records before release.</w:t>
       </w:r>
     </w:p>
     <w:p>
@@ -1387,7 +631,7 @@
         <w:pStyle w:val="Heading2"/>
       </w:pPr>
       <w:r>
-        <w:t>KK 02 Malicious logos and projects</w:t>
+        <w:t>KK 02 Malicious logos</w:t>
       </w:r>
     </w:p>
     <w:p>
@@ -1395,12 +639,12 @@
         <w:rPr>
           <w:b/>
         </w:rPr>
-        <w:t>HIGH | FIXED AND VERIFIED LOCALLY</w:t>
+        <w:t>HIGH | VERIFIED LOCALLY</w:t>
       </w:r>
     </w:p>
     <w:p>
       <w:r>
-        <w:t>A supplied logo or imported project could run code when previewed, potentially reading or changing the customer’s work. The preview now treats the logo as an image. The local regression passed; deploy and check normal imports.</w:t>
+        <w:t>Logo previews now treat SVG content as an image. The regression test confirms the old executable preview behavior is removed. Complete representative upload checks during release validation.</w:t>
       </w:r>
     </w:p>
     <w:p>
@@ -1416,12 +660,33 @@
         <w:rPr>
           <w:b/>
         </w:rPr>
-        <w:t>HIGH | FIXED BUT WAITING FOR CONFIRMATION</w:t>
+        <w:t>HIGH | WAITING FOR CONFIRMATION</w:t>
       </w:r>
     </w:p>
     <w:p>
       <w:r>
-        <w:t>Google sign-in could incorrectly activate or join an existing account. The local fix separates accounts and rejects unsafe matches. Confirm real Google signup and login, and review any accounts previously linked by the old flow.</w:t>
+        <w:t>Google accounts no longer silently merge with password accounts. Unsafe identities and collisions are rejected. Real Google testing and review of historically linked accounts remain required.</w:t>
+      </w:r>
+    </w:p>
+    <w:p>
+      <w:pPr>
+        <w:pStyle w:val="Heading2"/>
+      </w:pPr>
+      <w:r>
+        <w:t>KK 04 Google login request checks</w:t>
+      </w:r>
+    </w:p>
+    <w:p>
+      <w:r>
+        <w:rPr>
+          <w:b/>
+        </w:rPr>
+        <w:t>MEDIUM | WAITING FOR CONFIRMATION</w:t>
+      </w:r>
+    </w:p>
+    <w:p>
+      <w:r>
+        <w:t>Login requests are bound to the initiating browser and can be used only once. Local provider mocks pass; confirm the actual HTTPS provider and cookie lifecycle.</w:t>
       </w:r>
     </w:p>
     <w:p>
@@ -1442,7 +707,7 @@
         <w:pStyle w:val="Heading2"/>
       </w:pPr>
       <w:r>
-        <w:t>KK 04 Google login request checks</w:t>
+        <w:t>KK 05 Expiration</w:t>
       </w:r>
     </w:p>
     <w:p>
@@ -1450,33 +715,12 @@
         <w:rPr>
           <w:b/>
         </w:rPr>
-        <w:t>MEDIUM | FIXED BUT WAITING FOR CONFIRMATION</w:t>
+        <w:t>MEDIUM | VERIFIED LOCALLY</w:t>
       </w:r>
     </w:p>
     <w:p>
       <w:r>
-        <w:t>The old flow did not check which browser began Google login. This could put someone into the wrong account. A local fix binds the request to the browser; real sign-in testing remains.</w:t>
-      </w:r>
-    </w:p>
-    <w:p>
-      <w:pPr>
-        <w:pStyle w:val="Heading2"/>
-      </w:pPr>
-      <w:r>
-        <w:t>KK 05 Expired sessions and codes</w:t>
-      </w:r>
-    </w:p>
-    <w:p>
-      <w:r>
-        <w:rPr>
-          <w:b/>
-        </w:rPr>
-        <w:t>MEDIUM | FIXED AND VERIFIED LOCALLY</w:t>
-      </w:r>
-    </w:p>
-    <w:p>
-      <w:r>
-        <w:t>Expired sessions and email codes could work longer than intended. Corrected date checks now reject them in local tests. Confirm the deployed database behaves the same way.</w:t>
+        <w:t>Expired sessions and codes are rejected. Verification consumes the code transactionally, and sign-out revokes the server session.</w:t>
       </w:r>
     </w:p>
     <w:p>
@@ -1492,12 +736,12 @@
         <w:rPr>
           <w:b/>
         </w:rPr>
-        <w:t>MEDIUM | OPEN</w:t>
+        <w:t>MEDIUM | VERIFIED LOCALLY</w:t>
       </w:r>
     </w:p>
     <w:p>
       <w:r>
-        <w:t>The application does not limit repeated login, registration or verification attempts. This creates guessing and service-abuse risk. Add shared limits and stronger code generation; existing cloud-level rules were not available for review.</w:t>
+        <w:t>Shared request limits, strong code generation, protected code storage and single-use verification reduce guessing and email abuse. Approved sender and real delivery still need release checks.</w:t>
       </w:r>
     </w:p>
     <w:p>
@@ -1513,12 +757,12 @@
         <w:rPr>
           <w:b/>
         </w:rPr>
-        <w:t>MEDIUM | OPEN</w:t>
+        <w:t>MEDIUM | VERIFIED LOCALLY</w:t>
       </w:r>
     </w:p>
     <w:p>
       <w:r>
-        <w:t>Unexpected project data is accepted, and uploaded models have no clear size budget. This can break projects or stall the browser. Add validation and practical limits before expanding public use.</w:t>
+        <w:t>The app rejects oversized or malformed project data and unsafe custom model fixtures. Concurrent saves cannot exceed the ten-project limit. Supported custom formats now have explicit restrictions.</w:t>
       </w:r>
     </w:p>
     <w:p>
@@ -1534,12 +778,12 @@
         <w:rPr>
           <w:b/>
         </w:rPr>
-        <w:t>MEDIUM | OPEN</w:t>
+        <w:t>MEDIUM | VERIFIED LOCALLY</w:t>
       </w:r>
     </w:p>
     <w:p>
       <w:r>
-        <w:t>Signing out leaves designs and custom assets in the browser. Another person using the same browser profile may see them. Separate account storage and clear private state when people sign out.</w:t>
+        <w:t>Sign-out and account changes clear private browser state. Both the storage regressions and a two-tab built-editor test pass. Export important old drafts before rollout.</w:t>
       </w:r>
     </w:p>
     <w:p>
@@ -1547,7 +791,7 @@
         <w:pStyle w:val="Heading2"/>
       </w:pPr>
       <w:r>
-        <w:t>KK 09 Software package updates</w:t>
+        <w:t>KK 09 Software packages</w:t>
       </w:r>
     </w:p>
     <w:p>
@@ -1555,25 +799,12 @@
         <w:rPr>
           <w:b/>
         </w:rPr>
-        <w:t>MEDIUM | OPEN</w:t>
+        <w:t>MEDIUM | VERIFIED LOCALLY</w:t>
       </w:r>
     </w:p>
     <w:p>
       <w:r>
-        <w:t>The software tree contains known security alerts, mainly involving development and processing tools. Update and retest relevant packages. The scanner’s critical alert does not establish a critical flaw in the public website.</w:t>
-      </w:r>
-    </w:p>
-    <w:p>
-      <w:r>
-        <w:br w:type="page"/>
-      </w:r>
-    </w:p>
-    <w:p>
-      <w:pPr>
-        <w:pStyle w:val="Heading1"/>
-      </w:pPr>
-      <w:r>
-        <w:t>Findings summary continued</w:t>
+        <w:t>Unused packages were removed, versions pinned and vulnerable packages updated. The final advisory scan reports zero alerts; tests and the build pass.</w:t>
       </w:r>
     </w:p>
     <w:p>
@@ -1589,12 +820,12 @@
         <w:rPr>
           <w:b/>
         </w:rPr>
-        <w:t>LOW | FIXED AND VERIFIED LOCALLY</w:t>
+        <w:t>LOW | VERIFIED LOCALLY</w:t>
       </w:r>
     </w:p>
     <w:p>
       <w:r>
-        <w:t>Private account and project responses did not explicitly prohibit caching. The local change adds that instruction. Confirm it appears after deployment.</w:t>
+        <w:t>Account and project responses explicitly prohibit caching. Actual local middleware tests confirm this behavior.</w:t>
       </w:r>
     </w:p>
     <w:p>
@@ -1610,12 +841,12 @@
         <w:rPr>
           <w:b/>
         </w:rPr>
-        <w:t>LOW | OPEN</w:t>
+        <w:t>LOW | VERIFIED LOCALLY</w:t>
       </w:r>
     </w:p>
     <w:p>
       <w:r>
-        <w:t>The public site has some useful browser protections but lacks others, including a policy that limits executable content. Add and test the missing protections without breaking the editor.</w:t>
+        <w:t>Content, framing, transport and permission protections are configured. The built editor passes the local content-policy smoke test. Actual deployment headers remain a release check.</w:t>
       </w:r>
     </w:p>
     <w:p>
@@ -1631,12 +862,17 @@
         <w:rPr>
           <w:b/>
         </w:rPr>
-        <w:t>LOW | OPEN</w:t>
+        <w:t>LOW | VERIFIED LOCALLY</w:t>
       </w:r>
     </w:p>
     <w:p>
       <w:r>
-        <w:t>Registration tells a requester whether an email already has an account. Use consistent responses and limits to reduce unwanted account discovery.</w:t>
+        <w:t>Registration returns the same acknowledgement for known and unknown emails. Shared limits reduce repeated probing. No real customer addresses were tested.</w:t>
+      </w:r>
+    </w:p>
+    <w:p>
+      <w:r>
+        <w:br w:type="page"/>
       </w:r>
     </w:p>
     <w:p>
@@ -1650,13 +886,12 @@
     <w:tbl>
       <w:tblPr>
         <w:tblW w:type="auto" w:w="0"/>
-        <w:jc w:val="center"/>
         <w:tblLayout w:type="fixed"/>
         <w:tblLook w:firstColumn="1" w:firstRow="1" w:lastColumn="0" w:lastRow="0" w:noHBand="0" w:noVBand="1" w:val="04A0"/>
       </w:tblPr>
       <w:tblGrid>
-        <w:gridCol w:w="2952"/>
-        <w:gridCol w:w="6365"/>
+        <w:gridCol w:w="3312"/>
+        <w:gridCol w:w="6293"/>
       </w:tblGrid>
       <w:tr>
         <w:trPr>
@@ -1665,31 +900,17 @@
         </w:trPr>
         <w:tc>
           <w:tcPr>
-            <w:tcW w:type="dxa" w:w="2952"/>
-            <w:vAlign w:val="center"/>
-            <w:shd w:fill="243746"/>
-            <w:tcBorders>
-              <w:top w:val="single" w:sz="4" w:color="D9D9D9"/>
-              <w:left w:val="single" w:sz="4" w:color="D9D9D9"/>
-              <w:bottom w:val="single" w:sz="4" w:color="D9D9D9"/>
-              <w:right w:val="single" w:sz="4" w:color="D9D9D9"/>
-            </w:tcBorders>
-            <w:tcMar>
-              <w:top w:w="100" w:type="dxa"/>
-              <w:left w:w="100" w:type="dxa"/>
-              <w:bottom w:w="100" w:type="dxa"/>
-              <w:right w:w="100" w:type="dxa"/>
-            </w:tcMar>
+            <w:tcW w:type="dxa" w:w="3312"/>
+            <w:shd w:fill="E8EDF0"/>
           </w:tcPr>
           <w:p>
             <w:pPr>
-              <w:spacing w:after="40" w:before="40"/>
+              <w:spacing w:after="100"/>
             </w:pPr>
             <w:r>
               <w:rPr>
                 <w:b/>
-                <w:color w:val="FFFFFF"/>
-                <w:sz w:val="18"/>
+                <w:sz w:val="20"/>
               </w:rPr>
               <w:t>State</w:t>
             </w:r>
@@ -1697,31 +918,17 @@
         </w:tc>
         <w:tc>
           <w:tcPr>
-            <w:tcW w:type="dxa" w:w="6365"/>
-            <w:vAlign w:val="center"/>
-            <w:shd w:fill="243746"/>
-            <w:tcBorders>
-              <w:top w:val="single" w:sz="4" w:color="D9D9D9"/>
-              <w:left w:val="single" w:sz="4" w:color="D9D9D9"/>
-              <w:bottom w:val="single" w:sz="4" w:color="D9D9D9"/>
-              <w:right w:val="single" w:sz="4" w:color="D9D9D9"/>
-            </w:tcBorders>
-            <w:tcMar>
-              <w:top w:w="100" w:type="dxa"/>
-              <w:left w:w="100" w:type="dxa"/>
-              <w:bottom w:w="100" w:type="dxa"/>
-              <w:right w:w="100" w:type="dxa"/>
-            </w:tcMar>
+            <w:tcW w:type="dxa" w:w="6293"/>
+            <w:shd w:fill="E8EDF0"/>
           </w:tcPr>
           <w:p>
             <w:pPr>
-              <w:spacing w:after="40" w:before="40"/>
+              <w:spacing w:after="100"/>
             </w:pPr>
             <w:r>
               <w:rPr>
                 <w:b/>
-                <w:color w:val="FFFFFF"/>
-                <w:sz w:val="18"/>
+                <w:sz w:val="20"/>
               </w:rPr>
               <w:t>Findings</w:t>
             </w:r>
@@ -1734,31 +941,17 @@
         </w:trPr>
         <w:tc>
           <w:tcPr>
-            <w:tcW w:type="dxa" w:w="2952"/>
-            <w:vAlign w:val="center"/>
+            <w:tcW w:type="dxa" w:w="3312"/>
             <w:shd w:fill="FFFFFF"/>
-            <w:tcBorders>
-              <w:top w:val="single" w:sz="4" w:color="D9D9D9"/>
-              <w:left w:val="single" w:sz="4" w:color="D9D9D9"/>
-              <w:bottom w:val="single" w:sz="4" w:color="D9D9D9"/>
-              <w:right w:val="single" w:sz="4" w:color="D9D9D9"/>
-            </w:tcBorders>
-            <w:tcMar>
-              <w:top w:w="100" w:type="dxa"/>
-              <w:left w:w="100" w:type="dxa"/>
-              <w:bottom w:w="100" w:type="dxa"/>
-              <w:right w:w="100" w:type="dxa"/>
-            </w:tcMar>
           </w:tcPr>
           <w:p>
             <w:pPr>
-              <w:spacing w:after="40" w:before="40"/>
+              <w:spacing w:after="100"/>
             </w:pPr>
             <w:r>
               <w:rPr>
                 <w:b w:val="0"/>
-                <w:color w:val="000000"/>
-                <w:sz w:val="18"/>
+                <w:sz w:val="20"/>
               </w:rPr>
               <w:t>Fixed and verified locally</w:t>
             </w:r>
@@ -1766,33 +959,19 @@
         </w:tc>
         <w:tc>
           <w:tcPr>
-            <w:tcW w:type="dxa" w:w="6365"/>
-            <w:vAlign w:val="center"/>
+            <w:tcW w:type="dxa" w:w="6293"/>
             <w:shd w:fill="FFFFFF"/>
-            <w:tcBorders>
-              <w:top w:val="single" w:sz="4" w:color="D9D9D9"/>
-              <w:left w:val="single" w:sz="4" w:color="D9D9D9"/>
-              <w:bottom w:val="single" w:sz="4" w:color="D9D9D9"/>
-              <w:right w:val="single" w:sz="4" w:color="D9D9D9"/>
-            </w:tcBorders>
-            <w:tcMar>
-              <w:top w:w="100" w:type="dxa"/>
-              <w:left w:w="100" w:type="dxa"/>
-              <w:bottom w:w="100" w:type="dxa"/>
-              <w:right w:w="100" w:type="dxa"/>
-            </w:tcMar>
           </w:tcPr>
           <w:p>
             <w:pPr>
-              <w:spacing w:after="40" w:before="40"/>
+              <w:spacing w:after="100"/>
             </w:pPr>
             <w:r>
               <w:rPr>
                 <w:b w:val="0"/>
-                <w:color w:val="000000"/>
-                <w:sz w:val="18"/>
+                <w:sz w:val="20"/>
               </w:rPr>
-              <w:t>KK 02 logo preview; KK 05 expiration; KK 10 caching</w:t>
+              <w:t>9: KK 02, KK 05, KK 06, KK 07, KK 08, KK 09, KK 10, KK 11, KK 12</w:t>
             </w:r>
           </w:p>
         </w:tc>
@@ -1803,31 +982,17 @@
         </w:trPr>
         <w:tc>
           <w:tcPr>
-            <w:tcW w:type="dxa" w:w="2952"/>
-            <w:vAlign w:val="center"/>
-            <w:shd w:fill="F2F5F7"/>
-            <w:tcBorders>
-              <w:top w:val="single" w:sz="4" w:color="D9D9D9"/>
-              <w:left w:val="single" w:sz="4" w:color="D9D9D9"/>
-              <w:bottom w:val="single" w:sz="4" w:color="D9D9D9"/>
-              <w:right w:val="single" w:sz="4" w:color="D9D9D9"/>
-            </w:tcBorders>
-            <w:tcMar>
-              <w:top w:w="100" w:type="dxa"/>
-              <w:left w:w="100" w:type="dxa"/>
-              <w:bottom w:w="100" w:type="dxa"/>
-              <w:right w:w="100" w:type="dxa"/>
-            </w:tcMar>
+            <w:tcW w:type="dxa" w:w="3312"/>
+            <w:shd w:fill="FFFFFF"/>
           </w:tcPr>
           <w:p>
             <w:pPr>
-              <w:spacing w:after="40" w:before="40"/>
+              <w:spacing w:after="100"/>
             </w:pPr>
             <w:r>
               <w:rPr>
                 <w:b w:val="0"/>
-                <w:color w:val="000000"/>
-                <w:sz w:val="18"/>
+                <w:sz w:val="20"/>
               </w:rPr>
               <w:t>Fixed but waiting for confirmation</w:t>
             </w:r>
@@ -1835,33 +1000,19 @@
         </w:tc>
         <w:tc>
           <w:tcPr>
-            <w:tcW w:type="dxa" w:w="6365"/>
-            <w:vAlign w:val="center"/>
-            <w:shd w:fill="F2F5F7"/>
-            <w:tcBorders>
-              <w:top w:val="single" w:sz="4" w:color="D9D9D9"/>
-              <w:left w:val="single" w:sz="4" w:color="D9D9D9"/>
-              <w:bottom w:val="single" w:sz="4" w:color="D9D9D9"/>
-              <w:right w:val="single" w:sz="4" w:color="D9D9D9"/>
-            </w:tcBorders>
-            <w:tcMar>
-              <w:top w:w="100" w:type="dxa"/>
-              <w:left w:w="100" w:type="dxa"/>
-              <w:bottom w:w="100" w:type="dxa"/>
-              <w:right w:w="100" w:type="dxa"/>
-            </w:tcMar>
+            <w:tcW w:type="dxa" w:w="6293"/>
+            <w:shd w:fill="FFFFFF"/>
           </w:tcPr>
           <w:p>
             <w:pPr>
-              <w:spacing w:after="40" w:before="40"/>
+              <w:spacing w:after="100"/>
             </w:pPr>
             <w:r>
               <w:rPr>
                 <w:b w:val="0"/>
-                <w:color w:val="000000"/>
-                <w:sz w:val="18"/>
+                <w:sz w:val="20"/>
               </w:rPr>
-              <w:t>KK 03 Google account matching; KK 04 Google request checks</w:t>
+              <w:t>3: KK 01, KK 03, KK 04</w:t>
             </w:r>
           </w:p>
         </w:tc>
@@ -1872,65 +1023,37 @@
         </w:trPr>
         <w:tc>
           <w:tcPr>
-            <w:tcW w:type="dxa" w:w="2952"/>
-            <w:vAlign w:val="center"/>
+            <w:tcW w:type="dxa" w:w="3312"/>
             <w:shd w:fill="FFFFFF"/>
-            <w:tcBorders>
-              <w:top w:val="single" w:sz="4" w:color="D9D9D9"/>
-              <w:left w:val="single" w:sz="4" w:color="D9D9D9"/>
-              <w:bottom w:val="single" w:sz="4" w:color="D9D9D9"/>
-              <w:right w:val="single" w:sz="4" w:color="D9D9D9"/>
-            </w:tcBorders>
-            <w:tcMar>
-              <w:top w:w="100" w:type="dxa"/>
-              <w:left w:w="100" w:type="dxa"/>
-              <w:bottom w:w="100" w:type="dxa"/>
-              <w:right w:w="100" w:type="dxa"/>
-            </w:tcMar>
           </w:tcPr>
           <w:p>
             <w:pPr>
-              <w:spacing w:after="40" w:before="40"/>
+              <w:spacing w:after="100"/>
             </w:pPr>
             <w:r>
               <w:rPr>
                 <w:b w:val="0"/>
-                <w:color w:val="000000"/>
-                <w:sz w:val="18"/>
+                <w:sz w:val="20"/>
               </w:rPr>
-              <w:t>Still open</w:t>
+              <w:t>Still open without a fix</w:t>
             </w:r>
           </w:p>
         </w:tc>
         <w:tc>
           <w:tcPr>
-            <w:tcW w:type="dxa" w:w="6365"/>
-            <w:vAlign w:val="center"/>
+            <w:tcW w:type="dxa" w:w="6293"/>
             <w:shd w:fill="FFFFFF"/>
-            <w:tcBorders>
-              <w:top w:val="single" w:sz="4" w:color="D9D9D9"/>
-              <w:left w:val="single" w:sz="4" w:color="D9D9D9"/>
-              <w:bottom w:val="single" w:sz="4" w:color="D9D9D9"/>
-              <w:right w:val="single" w:sz="4" w:color="D9D9D9"/>
-            </w:tcBorders>
-            <w:tcMar>
-              <w:top w:w="100" w:type="dxa"/>
-              <w:left w:w="100" w:type="dxa"/>
-              <w:bottom w:w="100" w:type="dxa"/>
-              <w:right w:w="100" w:type="dxa"/>
-            </w:tcMar>
           </w:tcPr>
           <w:p>
             <w:pPr>
-              <w:spacing w:after="40" w:before="40"/>
+              <w:spacing w:after="100"/>
             </w:pPr>
             <w:r>
               <w:rPr>
                 <w:b w:val="0"/>
-                <w:color w:val="000000"/>
-                <w:sz w:val="18"/>
+                <w:sz w:val="20"/>
               </w:rPr>
-              <w:t>KK 01, KK 06, KK 07, KK 08, KK 09, KK 11, KK 12</w:t>
+              <w:t>0</w:t>
             </w:r>
           </w:p>
         </w:tc>
@@ -1941,31 +1064,17 @@
         </w:trPr>
         <w:tc>
           <w:tcPr>
-            <w:tcW w:type="dxa" w:w="2952"/>
-            <w:vAlign w:val="center"/>
-            <w:shd w:fill="F2F5F7"/>
-            <w:tcBorders>
-              <w:top w:val="single" w:sz="4" w:color="D9D9D9"/>
-              <w:left w:val="single" w:sz="4" w:color="D9D9D9"/>
-              <w:bottom w:val="single" w:sz="4" w:color="D9D9D9"/>
-              <w:right w:val="single" w:sz="4" w:color="D9D9D9"/>
-            </w:tcBorders>
-            <w:tcMar>
-              <w:top w:w="100" w:type="dxa"/>
-              <w:left w:w="100" w:type="dxa"/>
-              <w:bottom w:w="100" w:type="dxa"/>
-              <w:right w:w="100" w:type="dxa"/>
-            </w:tcMar>
+            <w:tcW w:type="dxa" w:w="3312"/>
+            <w:shd w:fill="FFFFFF"/>
           </w:tcPr>
           <w:p>
             <w:pPr>
-              <w:spacing w:after="40" w:before="40"/>
+              <w:spacing w:after="100"/>
             </w:pPr>
             <w:r>
               <w:rPr>
                 <w:b w:val="0"/>
-                <w:color w:val="000000"/>
-                <w:sz w:val="18"/>
+                <w:sz w:val="20"/>
               </w:rPr>
               <w:t>Accepted or deferred findings</w:t>
             </w:r>
@@ -1973,33 +1082,19 @@
         </w:tc>
         <w:tc>
           <w:tcPr>
-            <w:tcW w:type="dxa" w:w="6365"/>
-            <w:vAlign w:val="center"/>
-            <w:shd w:fill="F2F5F7"/>
-            <w:tcBorders>
-              <w:top w:val="single" w:sz="4" w:color="D9D9D9"/>
-              <w:left w:val="single" w:sz="4" w:color="D9D9D9"/>
-              <w:bottom w:val="single" w:sz="4" w:color="D9D9D9"/>
-              <w:right w:val="single" w:sz="4" w:color="D9D9D9"/>
-            </w:tcBorders>
-            <w:tcMar>
-              <w:top w:w="100" w:type="dxa"/>
-              <w:left w:w="100" w:type="dxa"/>
-              <w:bottom w:w="100" w:type="dxa"/>
-              <w:right w:w="100" w:type="dxa"/>
-            </w:tcMar>
+            <w:tcW w:type="dxa" w:w="6293"/>
+            <w:shd w:fill="FFFFFF"/>
           </w:tcPr>
           <w:p>
             <w:pPr>
-              <w:spacing w:after="40" w:before="40"/>
+              <w:spacing w:after="100"/>
             </w:pPr>
             <w:r>
               <w:rPr>
                 <w:b w:val="0"/>
-                <w:color w:val="000000"/>
-                <w:sz w:val="18"/>
+                <w:sz w:val="20"/>
               </w:rPr>
-              <w:t>None accepted. Future review topics are listed separately.</w:t>
+              <w:t>0; future review topics are separate.</w:t>
             </w:r>
           </w:p>
         </w:tc>
@@ -2008,17 +1103,7 @@
     <w:p/>
     <w:p>
       <w:r>
-        <w:t>The changes are in the local working copy. They have not been committed or published. Password migration, cloud settings and package updates were not performed. A successful local test cannot confirm real Google, email or production database behavior.</w:t>
-      </w:r>
-    </w:p>
-    <w:p>
-      <w:r>
-        <w:t>No cross-customer cloud-project access was demonstrated. No real secret appears in this report. An ignored local configuration file contains a Google secret; the scoped history scan did not identify a committed copy. Rotate credentials if they were shared or exposed elsewhere.</w:t>
-      </w:r>
-    </w:p>
-    <w:p>
-      <w:r>
-        <w:br w:type="page"/>
+        <w:t>The fixes are isolated on security-audit. No change was merged into main or deployed by this remediation. Local database tests use synthetic accounts and isolated data. Configuration secrets are excluded from the report.</w:t>
       </w:r>
     </w:p>
     <w:p>
@@ -2034,7 +1119,7 @@
         <w:rPr>
           <w:b/>
         </w:rPr>
-        <w:t>Are there issues that must be resolved before public release? YES.</w:t>
+        <w:t>Must anything be resolved before public release? YES.</w:t>
       </w:r>
     </w:p>
     <w:p>
@@ -2042,7 +1127,7 @@
         <w:pStyle w:val="ListBullet"/>
       </w:pPr>
       <w:r>
-        <w:t>Replace weak password storage and safely migrate existing accounts on the actual hosting runtime.</w:t>
+        <w:t>Apply the database migration, configure required secrets and approved email sender, strengthen dormant password records, review old Google-linked accounts and revoke affected sessions. Confirm hosting capacity for password hashing.</w:t>
       </w:r>
     </w:p>
     <w:p>
@@ -2050,7 +1135,7 @@
         <w:pStyle w:val="ListBullet"/>
       </w:pPr>
       <w:r>
-        <w:t>Deploy the reviewed fixes to controlled staging and confirm Google sign-in, account collisions, project imports, ownership and expiration. Review accounts affected by the old Google-linking behavior.</w:t>
+        <w:t>Complete real Google and email lifecycle checks on HTTPS staging, including new and returning users, account collisions, cancellation, delivery failures and expired codes.</w:t>
       </w:r>
     </w:p>
     <w:p>
@@ -2058,7 +1143,12 @@
         <w:pStyle w:val="ListBullet"/>
       </w:pPr>
       <w:r>
-        <w:t>Establish tested limits for account attempts, verification emails and project/file inputs. Resolve security alerts in any exposed development or processing tools.</w:t>
+        <w:t>Deploy the reviewed client and API together, then verify real headers, two-account cloud operations, sign-out cleanup and representative imports/exports on supported browsers.</w:t>
+      </w:r>
+    </w:p>
+    <w:p>
+      <w:r>
+        <w:br w:type="page"/>
       </w:r>
     </w:p>
     <w:p>
@@ -2071,12 +1161,12 @@
     </w:p>
     <w:p>
       <w:r>
-        <w:t>A security audit reduces risk but cannot prove that software contains zero vulnerabilities. This was a focused first review, not a complete certification. No real customer accounts were tested, and the Google, email and deployed database integrations were not exercised.</w:t>
+        <w:t>A security audit reduces risk but cannot prove that software contains zero vulnerabilities. This was a focused first review, not complete certification. Passing local tests does not certify the existing public deployment.</w:t>
       </w:r>
     </w:p>
     <w:p>
       <w:r>
-        <w:t>Cloud permissions, protective traffic rules, authenticated public workflows, recovery procedures and disruptive file or traffic tests were not tested. A password-reset feature was not found in the available implementation. These gaps are not assumed to be secure.</w:t>
+        <w:t>Real provider behavior, production database changes, infrastructure permissions, traffic capacity, complete model-format compatibility, recovery and incident response were not tested. No password-reset feature is included. Mocked browser accounts do not reproduce provider authentication.</w:t>
       </w:r>
     </w:p>
     <w:p>
@@ -2089,12 +1179,7 @@
     </w:p>
     <w:p>
       <w:r>
-        <w:t>After the release blockers are addressed, test two controlled customer accounts in staging and check import/export behavior. Review monitoring, incident response, backups and recovery, cloud permissions, build/deployment security, privacy obligations and resistance to service overload. Test complex file formats in isolation.</w:t>
-      </w:r>
-    </w:p>
-    <w:p>
-      <w:r>
-        <w:t>Schedule another review after launch and whenever major features are added, especially project sharing, payments or server-side file conversion.</w:t>
+        <w:t>After the release gates pass, review monitoring, incident response, backups and recovery, cloud and build permissions, privacy requirements, service-overload resilience and deeper file-format/business-logic testing. Repeat the review when project sharing, payments or server-side file conversion are introduced.</w:t>
       </w:r>
     </w:p>
     <w:p>
@@ -2107,12 +1192,12 @@
     </w:p>
     <w:p>
       <w:r>
-        <w:t>Public launch is not recommended yet. The project has useful ownership controls and several local fixes, but password protection remains a major risk. Complete the release blockers and obtain a fresh release decision based on the deployed, tested version.</w:t>
+        <w:t>The local security posture has improved substantially: all original findings have code fixes and all measured local gates pass. The remaining major uncertainty is whether the fixes and account migrations work correctly with the real deployment and providers.</w:t>
       </w:r>
     </w:p>
     <w:p>
       <w:r>
-        <w:t>A future GREEN decision would mean no known serious blockers remain within the reviewed scope. It would not mean the application is completely secure.</w:t>
+        <w:t>Proceed with controlled release validation. Approve a GREEN public launch only after the documented release gates have evidence. Until then the recommendation remains AMBER.</w:t>
       </w:r>
     </w:p>
     <w:sectPr>
@@ -2134,10 +1219,7 @@
       <w:jc w:val="right"/>
     </w:pPr>
     <w:r>
-      <w:rPr>
-        <w:sz w:val="18"/>
-      </w:rPr>
-      <w:t xml:space="preserve">KreateKaro  |  Security review  |  </w:t>
+      <w:t xml:space="preserve">KreateKaro  |  Security remediation review  |  </w:t>
     </w:r>
     <w:fldSimple w:instr="PAGE"/>
   </w:p>
@@ -2618,15 +1700,14 @@
     <w:pPr>
       <w:keepNext/>
       <w:keepLines/>
-      <w:spacing w:before="200" w:after="120"/>
+      <w:spacing w:before="200" w:after="0"/>
       <w:outlineLvl w:val="2"/>
     </w:pPr>
     <w:rPr>
-      <w:rFonts w:asciiTheme="majorHAnsi" w:eastAsiaTheme="majorEastAsia" w:hAnsiTheme="majorHAnsi" w:cstheme="majorBidi" w:ascii="Calibri" w:hAnsi="Calibri"/>
+      <w:rFonts w:asciiTheme="majorHAnsi" w:eastAsiaTheme="majorEastAsia" w:hAnsiTheme="majorHAnsi" w:cstheme="majorBidi"/>
       <w:b/>
       <w:bCs/>
-      <w:color w:val="000000"/>
-      <w:sz w:val="22"/>
+      <w:color w:val="4F81BD" w:themeColor="accent1"/>
     </w:rPr>
   </w:style>
   <w:style w:type="paragraph" w:styleId="Heading4">

</xml_diff>